<commit_message>
docs: clarify ACP and A2A activation gates
</commit_message>
<xml_diff>
--- a/Software_Decision_Fabric_Architecture_Final_VI_v1.5.docx
+++ b/Software_Decision_Fabric_Architecture_Final_VI_v1.5.docx
@@ -4727,13 +4727,13 @@
         <w:pStyle w:val="Heading1"/>
       </w:pPr>
       <w:r>
-        <w:t>11. Execution &amp; Protocol Plane: ACP, A2A, MCP và native fallback</w:t>
+        <w:t>11. Execution &amp; Protocol Plane: future ACP A2A MCP boundaries and native fallback</w:t>
       </w:r>
     </w:p>
     <w:p>
       <w:pPr/>
       <w:r>
-        <w:t>Final architecture không dùng một “agent gateway” proprietary làm contract duy nhất. SDF tách rõ semantic protocol khỏi runtime: ACP = Agent Client Protocol (ACP v1) điều khiển coding agent, A2A = Agent2Agent Protocol delegate giữa các agent systems/SDF, và MCP truy cập tools/resources; sandbox/worker manager vẫn chịu trách nhiệm process, isolation, resource limit và recovery. Không dùng chữ ACP không định danh; “Agent Communication Protocol (BeeAI ACP, legacy/merged)” là protocol khác.</w:t>
+        <w:t>Kiến trúc đích không dùng một “agent gateway” proprietary làm contract duy nhất. SDF tách rõ semantic protocol khỏi runtime: ACP = Agent Client Protocol (ACP v1) điều khiển coding agent, A2A = Agent2Agent Protocol delegate giữa các agent systems/SDF, và MCP truy cập tools/resources; sandbox/worker manager vẫn chịu trách nhiệm process, isolation, resource limit và recovery. Đây là các boundary có thể mở rộng về sau, không phải cam kết triển khai trong SDF Core v0. Không dùng chữ ACP không định danh; “Agent Communication Protocol (BeeAI ACP, legacy/merged)” là protocol khác.</w:t>
       </w:r>
     </w:p>
     <w:p>
@@ -9675,7 +9675,7 @@
         <w:keepNext/>
       </w:pPr>
       <w:r>
-        <w:t>18.1 MVP tối thiểu</w:t>
+        <w:t>18.1 MVP tối thiểu của SDF Core v0</w:t>
       </w:r>
     </w:p>
     <w:p>
@@ -9702,7 +9702,7 @@
         <w:ind w:left="0" w:firstLine="0"/>
       </w:pPr>
       <w:r>
-        <w:t>3.  Agent Interface Router: một native adapter trước; thêm ACP v1 adapter khi có integration coding agent thứ hai hoặc nhu cầu editor/client portability được xác nhận; capability negotiation + interface SLO metrics.</w:t>
+        <w:t>3.  Agent Interface Router: chỉ một native adapter trong Core v0. ACP v1 là hạng mục interoperability sau Core v0, chỉ thêm khi có integration coding agent thứ hai hoặc nhu cầu editor/client portability được xác nhận.</w:t>
       </w:r>
     </w:p>
     <w:p>
@@ -10301,7 +10301,7 @@
     <w:p>
       <w:pPr/>
       <w:r>
-        <w:t>Trước các activation gate trên, internal interface + native adapter + MCP cho tool/resource access là đủ; SDF Task, State, Budget, Policy và Evaluator vẫn là source of truth.</w:t>
+        <w:t>Trước các activation gate trên, internal interface + native adapter + MCP cho tool/resource access là đủ; SDF Task, State, Budget, Policy và Evaluator vẫn là source of truth. Core v0 không triển khai ACP hoặc A2A trong execution path.</w:t>
       </w:r>
     </w:p>
     <w:p>

</xml_diff>

<commit_message>
docs: record runtime research and architecture sync verification limits
</commit_message>
<xml_diff>
--- a/Software_Decision_Fabric_Architecture_Final_VI_v1.5.docx
+++ b/Software_Decision_Fabric_Architecture_Final_VI_v1.5.docx
@@ -22,7 +22,7 @@
         <w:jc w:val="center"/>
       </w:pPr>
       <w:r>
-        <w:t>Architecture, Intent/Decision Graph, Business Economics, Protocols, FinOps, Safety, Operations &amp; Handoff</w:t>
+        <w:t>Architecture, Intent/Decision Graph, Business Economics, Execution Runtime, FinOps, Safety, Operations &amp; Handoff</w:t>
       </w:r>
     </w:p>
     <w:p>
@@ -102,7 +102,7 @@
     </w:p>
     <w:p>
       <w:r>
-        <w:t>SDF không phải một coding agent mới mà là control/decision/learning system phía trên nhiều agent và runtime. Research thesis trung tâm là Intent/Decision Graph: duy trì traceability hai chiều từ business objective, economic assumption và policy tới architecture decision, requirement, task, code/release, rồi quay lại runtime evidence để xác minh hoặc bác bỏ giả định ban đầu. Business Context và Business Economics đi trước architecture; FinOps là economic control plane xuyên build, release và runtime. Agent interoperability được tách thành ba protocol boundary: ACP cho boundary client-to-coding-agent, A2A cho boundary agent-system-to-agent-system, MCP cho boundary agent-to-tools/resources; native adapter luôn tồn tại như fallback nếu protocol adapter không đạt SLO. Human interface thuộc SDF Console và các external adapters, không nằm trên critical execution path. Software do SDF tạo ra phải mang theo source + tests + SBOM/provenance + Project Passport + Policy Pack + Intent/Decision snapshot + economics/ + finops/ để human hoặc một SDF khác tiếp quản cả technical intent lẫn business intent.</w:t>
+        <w:t>SDF không phải một coding agent mới mà là control/decision/learning system phía trên agent runtime. Research thesis trung tâm là Intent/Decision Graph: duy trì traceability hai chiều từ business objective, economic assumption và policy tới architecture decision, requirement, task, code/release, rồi quay lại runtime evidence để xác minh hoặc bác bỏ giả định ban đầu. Business Context và Business Economics đi trước architecture; FinOps là economic control plane xuyên build, release và runtime. Core v0 dùng một internal Agent Runtime interface và một execution provider dự kiến là HerdrRuntime, còn Tool Proxy, Policy và sandbox chịu trách nhiệm kiểm soát hành động. ACP/A2A chỉ được giữ như historical research và không thuộc active roadmap. Human interface thuộc SDF Console và các external adapters, không nằm trên critical execution path. Software do SDF tạo ra phải mang theo source + tests + SBOM/provenance + Project Passport + Policy Pack + Intent/Decision snapshot + economics/ + finops/ để human hoặc một SDF khác tiếp quản cả technical intent lẫn business intent.</w:t>
       </w:r>
     </w:p>
     <w:p>
@@ -111,35 +111,33 @@
         <w:keepLines/>
       </w:pPr>
       <w:r>
-        <w:t>Business Context / Customer / Market</w:t>
-        <w:br/>
-        <w:t xml:space="preserve">              ↓</w:t>
-        <w:br/>
-        <w:t xml:space="preserve">      Business Economics</w:t>
-        <w:br/>
-        <w:t xml:space="preserve">   Cost / Value / Pricing</w:t>
-        <w:br/>
-        <w:t xml:space="preserve">              ↓</w:t>
-        <w:br/>
-        <w:t xml:space="preserve">       Intent/Decision Graph</w:t>
-        <w:br/>
-        <w:t xml:space="preserve">              ↓</w:t>
-        <w:br/>
-        <w:t xml:space="preserve">             SDF</w:t>
-        <w:br/>
-        <w:t xml:space="preserve"> Control + Policy + Learning</w:t>
-        <w:br/>
-        <w:t xml:space="preserve">       ┌──────┼──────┐</w:t>
-        <w:br/>
-        <w:t xml:space="preserve">      A2A    ACP     MCP</w:t>
-        <w:br/>
-        <w:t xml:space="preserve">       │      │       │</w:t>
-        <w:br/>
-        <w:t xml:space="preserve"> Agent/SDF  Coding   Tools</w:t>
-        <w:br/>
-        <w:t xml:space="preserve"> Systems    Agents   APIs</w:t>
-        <w:br/>
-        <w:t xml:space="preserve">              ↓</w:t>
+        <w:t xml:space="preserve">       ┌───────────────┐</w:t>
+        <w:br/>
+        <w:t xml:space="preserve">       │ Internal Agent │</w:t>
+        <w:br/>
+        <w:t xml:space="preserve">       │    Runtime     │</w:t>
+        <w:br/>
+        <w:t xml:space="preserve">       └───────┬───────┘</w:t>
+        <w:br/>
+        <w:t xml:space="preserve">               ↓</w:t>
+        <w:br/>
+        <w:t xml:space="preserve">          HerdrRuntime</w:t>
+        <w:br/>
+        <w:t xml:space="preserve">   (intended, pending verification)</w:t>
+        <w:br/>
+        <w:t xml:space="preserve">               ↓</w:t>
+        <w:br/>
+        <w:t xml:space="preserve">     One coding agent / harness</w:t>
+        <w:br/>
+        <w:t xml:space="preserve">               ↓</w:t>
+        <w:br/>
+        <w:t xml:space="preserve">     Enforced Sandbox / Worker</w:t>
+        <w:br/>
+        <w:t xml:space="preserve">               ↓</w:t>
+        <w:br/>
+        <w:t xml:space="preserve">     Tool Proxy + Policy → Tools</w:t>
+        <w:br/>
+        <w:t xml:space="preserve">               ↓</w:t>
         <w:br/>
         <w:t xml:space="preserve"> Software + Maintainability + Economic Package</w:t>
       </w:r>
@@ -752,7 +750,7 @@
           </w:tcPr>
           <w:p>
             <w:r>
-              <w:t>ACP Client, Native Adapter, Workspace Manager, Sandbox/Worker Runtime, Agents</w:t>
+              <w:t>Internal Agent Runtime, intended HerdrRuntime, Workspace Manager, Enforced Sandbox/Worker, one Agent</w:t>
             </w:r>
           </w:p>
         </w:tc>
@@ -1260,7 +1258,7 @@
           </w:tcPr>
           <w:p>
             <w:r>
-              <w:t>Protocol &amp; Interop Plane</w:t>
+              <w:t>Historical Interoperability Notes</w:t>
             </w:r>
           </w:p>
         </w:tc>
@@ -1270,7 +1268,7 @@
           </w:tcPr>
           <w:p>
             <w:r>
-              <w:t>Chuẩn hóa giao tiếp giữa SDF, coding agents, agent systems và tools; protocol failure không được làm mất khả năng thực thi.</w:t>
+              <w:t>Retained historical research; does not define an active Core v0 execution plane.</w:t>
             </w:r>
           </w:p>
         </w:tc>
@@ -1280,7 +1278,7 @@
           </w:tcPr>
           <w:p>
             <w:r>
-              <w:t>ACP v1, A2A 1.0, MCP, capability negotiation, native fallback</w:t>
+              <w:t>ACP/A2A/MCP historical notes; current boundary is Internal Agent Runtime + Tool Proxy/Policy + enforced sandbox</w:t>
             </w:r>
           </w:p>
         </w:tc>
@@ -1297,76 +1295,43 @@
         <w:keepLines/>
       </w:pPr>
       <w:r>
-        <w:t>BUSINESS CONTEXT / ECONOMICS</w:t>
-        <w:br/>
-        <w:t>Customer | Use case | Value | Market | Contract | Price Corridor</w:t>
+        <w:t>EXECUTION RUNTIME</w:t>
+        <w:br/>
+        <w:t xml:space="preserve">       Internal Agent Runtime</w:t>
+        <w:br/>
+        <w:t xml:space="preserve">                  ↓</w:t>
+        <w:br/>
+        <w:t xml:space="preserve">              HerdrRuntime</w:t>
+        <w:br/>
+        <w:t xml:space="preserve">       (intended, pending verification)</w:t>
+        <w:br/>
+        <w:t xml:space="preserve">                  ↓</w:t>
+        <w:br/>
+        <w:t xml:space="preserve">        One coding agent / harness</w:t>
+        <w:br/>
+        <w:t xml:space="preserve">                  ↓</w:t>
+        <w:br/>
+        <w:t xml:space="preserve">       Enforced Sandbox / Worker</w:t>
+        <w:br/>
+        <w:t xml:space="preserve">                  ↓</w:t>
+        <w:br/>
+        <w:t xml:space="preserve">       Tool Proxy + Policy → Tools</w:t>
         <w:br/>
         <w:t xml:space="preserve">                         ↓</w:t>
         <w:br/>
-        <w:t xml:space="preserve">                 INTENT / DECISION GRAPH</w:t>
-        <w:br/>
-        <w:t>Objective → Assumption → Constraint → ADR → Requirement → Task</w:t>
-        <w:br/>
-        <w:t xml:space="preserve">      ↑                                              ↓</w:t>
-        <w:br/>
-        <w:t>Runtime Evidence ← Metric / Eval ← Release ← Code / Infrastructure</w:t>
+        <w:t xml:space="preserve">       CI → signed artifact → GitOps/CD → Runtime</w:t>
         <w:br/>
         <w:t xml:space="preserve">                         ↓</w:t>
         <w:br/>
-        <w:t>HUMAN / WORK SYSTEMS</w:t>
-        <w:br/>
-        <w:t>Jira | Linear | GitHub Issues | Notion | SDF Console | Backstage</w:t>
+        <w:t xml:space="preserve">          Observability → Alert Router → Incident</w:t>
         <w:br/>
         <w:t xml:space="preserve">                         ↓</w:t>
         <w:br/>
-        <w:t xml:space="preserve">                    SDF CONTROL</w:t>
-        <w:br/>
-        <w:t>Task / Planner / State / Router / Scheduler / Release / Environment</w:t>
-        <w:br/>
-        <w:t xml:space="preserve">        ┌────────────────┼────────────────┐</w:t>
-        <w:br/>
-        <w:t xml:space="preserve">        ↓                ↓                ↓</w:t>
-        <w:br/>
-        <w:t xml:space="preserve"> Memory + Context     Policy Plane     Quality + Learning</w:t>
-        <w:br/>
-        <w:t xml:space="preserve">        └────────────────┼────────────────┘</w:t>
+        <w:t xml:space="preserve">                FinOps / Actual Economics</w:t>
         <w:br/>
         <w:t xml:space="preserve">                         ↓</w:t>
         <w:br/>
-        <w:t xml:space="preserve">                 PROTOCOL / INTEROP</w:t>
-        <w:br/>
-        <w:t xml:space="preserve">             A2A      ACP      MCP</w:t>
-        <w:br/>
-        <w:t xml:space="preserve">              │        │        │</w:t>
-        <w:br/>
-        <w:t xml:space="preserve">        Agent systems  │      Tools/APIs</w:t>
-        <w:br/>
-        <w:t xml:space="preserve">                       ↓</w:t>
-        <w:br/>
-        <w:t xml:space="preserve">             Coding Agents + Native Fallback</w:t>
-        <w:br/>
-        <w:t xml:space="preserve">                         ↓</w:t>
-        <w:br/>
-        <w:t xml:space="preserve">                Sandbox / Worker Runtime</w:t>
-        <w:br/>
-        <w:t xml:space="preserve">                         ↓</w:t>
-        <w:br/>
-        <w:t xml:space="preserve">       CI → signed artifact → GitOps/CD → Runtime</w:t>
-        <w:br/>
-        <w:t xml:space="preserve">                         ↓</w:t>
-        <w:br/>
-        <w:t xml:space="preserve">          Observability → Alert Router → Incident</w:t>
-        <w:br/>
-        <w:t xml:space="preserve">                         ↓</w:t>
-        <w:br/>
-        <w:t xml:space="preserve">                FinOps / Actual Economics</w:t>
-        <w:br/>
-        <w:t xml:space="preserve">                         ↓</w:t>
-        <w:br/>
         <w:t xml:space="preserve">        Evidence updates Decision Graph → ADAPT</w:t>
-        <w:br/>
-        <w:br/>
-        <w:t>OUTPUT: software + SBOM/provenance + Project Passport + Policy Pack + Decision Graph + economics/ + finops/</w:t>
       </w:r>
     </w:p>
     <w:p>
@@ -2597,7 +2562,7 @@
           </w:tcPr>
           <w:p>
             <w:r>
-              <w:t>ACP/native/A2A interface và execution backend nào phù hợp?</w:t>
+              <w:t>Internal Agent Runtime và execution provider nào phù hợp?</w:t>
             </w:r>
           </w:p>
         </w:tc>
@@ -4727,13 +4692,13 @@
         <w:pStyle w:val="Heading1"/>
       </w:pPr>
       <w:r>
-        <w:t>11. Execution &amp; Protocol Plane: future ACP A2A MCP boundaries and native fallback</w:t>
+        <w:t>11. Execution Runtime Plane: internal runtime and historical interoperability notes</w:t>
       </w:r>
     </w:p>
     <w:p>
       <w:pPr/>
       <w:r>
-        <w:t>Kiến trúc đích không dùng một “agent gateway” proprietary làm contract duy nhất. SDF tách rõ semantic protocol khỏi runtime: ACP = Agent Client Protocol (ACP v1) điều khiển coding agent, A2A = Agent2Agent Protocol delegate giữa các agent systems/SDF, và MCP truy cập tools/resources; sandbox/worker manager vẫn chịu trách nhiệm process, isolation, resource limit và recovery. Đây là các boundary có thể mở rộng về sau, không phải cam kết triển khai trong SDF Core v0. Không dùng chữ ACP không định danh; “Agent Communication Protocol (BeeAI ACP, legacy/merged)” là protocol khác.</w:t>
+        <w:t>ADR-0004 supersedes the earlier protocol-first execution direction. The active SDF Core v0 path is SDF Control Plane → internal Agent Runtime → intended HerdrRuntime → one coding agent → enforced sandbox → Tool Proxy/Policy → tools. Herdr remains an intended execution/session provider pending verification of its authoritative repository, version, license and supported lifecycle operations; this document makes no claim that those operations have been verified. ACP (Agent Client Protocol) and A2A (Agent2Agent Protocol) remain below as historical interoperability research only. They are removed from the active roadmap and do not belong in the Core v0 execution path. MCP may be evaluated at the tool/resource boundary, but Tool Proxy and Policy remain the enforcement boundary.</w:t>
       </w:r>
     </w:p>
     <w:p>
@@ -4741,7 +4706,7 @@
         <w:pStyle w:val="Heading2"/>
       </w:pPr>
       <w:r>
-        <w:t>11.1 Ba protocol boundary</w:t>
+        <w:t>11.1 Current execution runtime boundary</w:t>
       </w:r>
     </w:p>
     <w:p>
@@ -4749,25 +4714,34 @@
         <w:pStyle w:val="CodeBlock"/>
       </w:pPr>
       <w:r>
-        <w:t>STACK A — A2A = Agent2Agent Protocol</w:t>
-        <w:br/>
-        <w:t>Boundary: agent system ↔ agent system, thường qua network/trust domain khác.</w:t>
-        <w:br/>
-        <w:t>Chuẩn hóa: Agent Card/discovery, capability/skill, message, remote Task/Artifact, streaming, async push và auth.</w:t>
-        <w:br/>
-        <w:t>Dùng cho Security/FinOps/Release/Incident Agent hoặc một SDF khác.</w:t>
-        <w:br/>
-        <w:br/>
-        <w:t>STACK B — ACP = Agent Client Protocol (ACP v1)</w:t>
-        <w:br/>
-        <w:t>Boundary: SDF/client/editor ↔ coding agent hoặc harness.</w:t>
-        <w:br/>
-        <w:t>Chuẩn hóa: JSON-RPC, initialize/capability negotiation, session/prompt/update, cancellation, permissions và coding-agent content.</w:t>
-        <w:br/>
-        <w:t>Dùng cho Codex/Claude/Pi/Hermes adapters; native adapter là fallback.</w:t>
-        <w:br/>
-        <w:br/>
-        <w:t>Cả hai không thay Task Manager, Scheduler, State Manager, Sandbox Manager, Event Bus, Policy Plane, Evaluator hoặc Intent/Decision Graph.</w:t>
+        <w:t>SDF Control Plane</w:t>
+        <w:br/>
+        <w:t xml:space="preserve">      ↓</w:t>
+        <w:br/>
+        <w:t>Internal Agent Runtime</w:t>
+        <w:br/>
+        <w:t xml:space="preserve">      ↓</w:t>
+        <w:br/>
+        <w:t>HerdrRuntime (intended; pending verification)</w:t>
+        <w:br/>
+        <w:t xml:space="preserve">      ↓</w:t>
+        <w:br/>
+        <w:t>One coding agent / harness</w:t>
+        <w:br/>
+        <w:t xml:space="preserve">      ↓</w:t>
+        <w:br/>
+        <w:t>Enforced Sandbox / Worker</w:t>
+        <w:br/>
+        <w:t xml:space="preserve">      ↓</w:t>
+        <w:br/>
+        <w:t>Tool Proxy + Policy</w:t>
+        <w:br/>
+        <w:t xml:space="preserve">      ↓</w:t>
+        <w:br/>
+        <w:t>Tools and workspace</w:t>
+        <w:br/>
+        <w:br/>
+        <w:t>SDF remains the source of truth for Task, Attempt, State, Budget, Policy, Evaluator, Evidence and Decision Graph. Herdr owns session/process lifecycle only; it does not become an SDF domain model or protocol contract.</w:t>
       </w:r>
     </w:p>
     <w:tbl>
@@ -4845,7 +4819,7 @@
           </w:tcPr>
           <w:p>
             <w:r>
-              <w:t>Session/prompt/update/permission/cancel với coding agents; optional portable interface khi có từ hai integration hoặc đạt activation gate.</w:t>
+              <w:t>Historical ACP v1 research: session/prompt/update/permission/cancel with coding agents; excluded from active Core v0 roadmap.</w:t>
             </w:r>
           </w:p>
         </w:tc>
@@ -4880,7 +4854,7 @@
           </w:tcPr>
           <w:p>
             <w:r>
-              <w:t>Optional discovery/delegation giữa specialist agents, remote agent systems hoặc SDF khác; chỉ bật khi có remote use case thực.</w:t>
+              <w:t>Historical A2A 1.0 research: discovery/delegation between specialist agents or SDFs; requires a future concrete requirement and separate ADR.</w:t>
             </w:r>
           </w:p>
         </w:tc>
@@ -4915,7 +4889,7 @@
           </w:tcPr>
           <w:p>
             <w:r>
-              <w:t>Chuẩn tool/resource integration cho agent.</w:t>
+              <w:t>MCP may be evaluated at the tool/resource boundary; Tool Proxy and Policy remain the enforcement boundary.</w:t>
             </w:r>
           </w:p>
         </w:tc>
@@ -4950,7 +4924,7 @@
           </w:tcPr>
           <w:p>
             <w:r>
-              <w:t>Fallback/escape hatch khi protocol adapter chậm, thiếu capability hoặc không ổn định.</w:t>
+              <w:t>Current Internal Agent Runtime seam; HerdrRuntime is the intended first provider pending verification.</w:t>
             </w:r>
           </w:p>
         </w:tc>
@@ -4971,18 +4945,18 @@
         <w:pStyle w:val="Heading2"/>
       </w:pPr>
       <w:r>
-        <w:t>11.2 ACP Agent Client Protocol primary interface có điều kiện</w:t>
-      </w:r>
-    </w:p>
-    <w:p>
-      <w:r>
-        <w:t>ACP identity note: ACP ở đây luôn có nghĩa là Agent Client Protocol v1. ACP chỉ là coding-session adapter; SDF vẫn sở hữu logical Task/Attempt, state, budget, policy, sandbox, evaluator và runtime evidence. ACP permission hoặc tool-call metadata không thay thế authorization của Policy Plane/Tool Proxy.</w:t>
+        <w:t>11.2 Internal Agent Runtime contract</w:t>
+      </w:r>
+    </w:p>
+    <w:p>
+      <w:r>
+        <w:t>AgentRuntime is the intentionally small internal contract for execution/session control: start, send, stream, cancel, status and terminate. It carries an SDF Attempt correlation but does not own Task, policy, evaluation or Evidence. Tool requests must cross the SDF Tool Proxy and Policy boundary; terminal output is not a trusted tool request.</w:t>
       </w:r>
     </w:p>
     <w:p>
       <w:pPr/>
       <w:r>
-        <w:t>ACP v1 là stable protocol contract cho client-to-coding-agent. SDF nên pin stable v1, dùng initialize/capability negotiation, stream session/update trực tiếp vào SDF event stream và không giả định mọi ACP agent có cùng capability. Các v2/unstable features chỉ bật sau negotiation và không được trở thành dependency bắt buộc của core.</w:t>
+        <w:t>The first runtime slice supports one agent and keeps a fake runtime for deterministic tests. Required behavior is dispatch, streamed output, timeout, cancellation, reconnect and verified termination. These are SDF acceptance criteria to validate against the chosen provider; they are not claims about Herdr support.</w:t>
       </w:r>
     </w:p>
     <w:p>
@@ -4990,22 +4964,23 @@
         <w:pStyle w:val="CodeBlock"/>
       </w:pPr>
       <w:r>
-        <w:t>Task → Router → Agent Interface</w:t>
-        <w:br/>
-        <w:t xml:space="preserve">                 ├─ ACP v1  (preferred when healthy)</w:t>
-        <w:br/>
-        <w:t xml:space="preserve">                 └─ Native  (fallback)</w:t>
-        <w:br/>
-        <w:br/>
-        <w:t>ACP event → SDF Event Stream → WebSocket/SSE → SDF Console</w:t>
-        <w:br/>
-        <w:t xml:space="preserve">           ↘ Evaluation / Audit / Metrics</w:t>
+        <w:t>Task → Runtime Dispatch → AgentRuntime</w:t>
+        <w:br/>
+        <w:t xml:space="preserve">                      ↓</w:t>
+        <w:br/>
+        <w:t xml:space="preserve">                  HerdrRuntime</w:t>
+        <w:br/>
+        <w:t xml:space="preserve">                      ↓</w:t>
+        <w:br/>
+        <w:t xml:space="preserve">             Runtime events → SDF Event Stream</w:t>
+        <w:br/>
+        <w:t xml:space="preserve">                      ↘ Evaluator / Audit / Metrics</w:t>
       </w:r>
     </w:p>
     <w:p>
       <w:pPr/>
       <w:r>
-        <w:t>Độ ổn định phải được đo bằng evidence, không dựa vào việc protocol “đẹp” về kiến trúc. Capability Registry nên giữ latency/reliability theo từng interface: spawn, initialize, session create, time-to-first-agent-event, time-to-first-text, final result, cancellation và failure rate.</w:t>
+        <w:t>Runtime behavior must be measured with Evidence, not inferred from an attractive interface design. The Capability Registry should record provider latency and reliability for session start, first event, final result, cancellation, reconnect and failure.</w:t>
       </w:r>
     </w:p>
     <w:p>
@@ -5013,13 +4988,13 @@
         <w:pStyle w:val="Heading2"/>
       </w:pPr>
       <w:r>
-        <w:t>11.3 Native adapter fallback và interface SLO</w:t>
+        <w:t>11.3 HerdrRuntime intended first implementation</w:t>
       </w:r>
     </w:p>
     <w:p>
       <w:pPr/>
       <w:r>
-        <w:t>Nếu ACP adapter của Codex/Claude/Pi/Hermes chậm, treo hoặc mất event, Router được phép chuyển sang native adapter. Native path không phải failure của architecture; nó là safety valve giúp SDF không khóa critical path vào maturity của một protocol implementation.</w:t>
+        <w:t>HerdrRuntime is the intended first real implementation of AgentRuntime because the architecture identifies Herdr as a persistent terminal/session fleet. Before implementation, verify the authoritative repository, version, license and actual operations. Until containment and provider verification are complete, run real agents only against bounded disposable fixtures with restricted authority. Keep the fake runtime for deterministic tests and record missing operations explicitly.</w:t>
       </w:r>
     </w:p>
     <w:p>
@@ -5027,28 +5002,33 @@
         <w:pStyle w:val="CodeBlock"/>
       </w:pPr>
       <w:r>
-        <w:t>agent: codex</w:t>
-        <w:br/>
-        <w:t>interfaces:</w:t>
-        <w:br/>
-        <w:t xml:space="preserve">  acp:</w:t>
-        <w:br/>
-        <w:t xml:space="preserve">    enabled: true</w:t>
-        <w:br/>
-        <w:t xml:space="preserve">    p95_ttft_ms: measured</w:t>
-        <w:br/>
-        <w:t xml:space="preserve">    reliability: measured</w:t>
-        <w:br/>
-        <w:t xml:space="preserve">  native:</w:t>
-        <w:br/>
-        <w:t xml:space="preserve">    enabled: true</w:t>
-        <w:br/>
-        <w:t xml:space="preserve">    p95_ttft_ms: measured</w:t>
-        <w:br/>
-        <w:t xml:space="preserve">    reliability: measured</w:t>
-        <w:br/>
-        <w:br/>
-        <w:t>Router chooses by capability + SLO + policy + cost.</w:t>
+        <w:t>runtime: herdr</w:t>
+        <w:br/>
+        <w:t>verification:</w:t>
+        <w:br/>
+        <w:t xml:space="preserve">  repository: pending</w:t>
+        <w:br/>
+        <w:t xml:space="preserve">  version: pending</w:t>
+        <w:br/>
+        <w:t xml:space="preserve">  license: pending</w:t>
+        <w:br/>
+        <w:t xml:space="preserve">  lifecycle_operations: pending</w:t>
+        <w:br/>
+        <w:br/>
+        <w:t>session:</w:t>
+        <w:br/>
+        <w:t xml:space="preserve">  attempt_id: required</w:t>
+        <w:br/>
+        <w:t xml:space="preserve">  session_id: provider-assigned</w:t>
+        <w:br/>
+        <w:t xml:space="preserve">  agent: one selected agent</w:t>
+        <w:br/>
+        <w:t xml:space="preserve">  workspace: disposable fixture</w:t>
+        <w:br/>
+        <w:t xml:space="preserve">  status: start | running | cancelling | completed | failed | terminated</w:t>
+        <w:br/>
+        <w:br/>
+        <w:t>Runtime selection remains an internal SDF decision; no external protocol is required.</w:t>
       </w:r>
     </w:p>
     <w:p>
@@ -5056,18 +5036,18 @@
         <w:pStyle w:val="Heading2"/>
       </w:pPr>
       <w:r>
-        <w:t>11.4 A2A Agent2Agent Protocol delegation giữa agent systems và SDF</w:t>
-      </w:r>
-    </w:p>
-    <w:p>
-      <w:r>
-        <w:t>A2A identity note: A2A ở đây luôn có nghĩa là Agent2Agent Protocol. A2A Task chỉ là remote delegation/attempt; SDF Task là source of truth. A2A boundary phải enforce identity, authN/authZ, data classification, budget/quota và audit; không dùng A2A cho editor UX hoặc coding-session control.</w:t>
+        <w:t>11.4 Historical interoperability research superseded by ADR-0004</w:t>
+      </w:r>
+    </w:p>
+    <w:p>
+      <w:r>
+        <w:t>Historical note: A2A means Agent2Agent Protocol and ACP means Agent Client Protocol. The following protocol analysis records the earlier architecture research; it is retained for traceability and does not create implementation work. ADR-0004 removes ACP adapters and A2A gateways from the active roadmap. Reopening either requires a concrete external-client or independent-agent-system requirement and a new architecture decision.</w:t>
       </w:r>
     </w:p>
     <w:p>
       <w:pPr/>
       <w:r>
-        <w:t>A2A phù hợp cho capability-level delegation: Security Agent, FinOps Agent, Release Agent, Incident Agent hoặc một SDF ở tổ chức khác. A2A Task chỉ là một remote delegation/attempt; SDF Task vẫn là logical work unit giữ dependency, budget, acceptance criteria, attempts, cost, policy và Intent/Decision linkage.</w:t>
+        <w:t>Earlier research considered A2A suitable for capability-level delegation to Security, FinOps, Release or Incident agents and to an independent SDF. That option is intentionally historical: the current system uses an internal runtime boundary, and an A2A Task must not become the SDF source of truth if a future requirement reopens the decision.</w:t>
       </w:r>
     </w:p>
     <w:p>
@@ -5075,22 +5055,12 @@
         <w:pStyle w:val="CodeBlock"/>
       </w:pPr>
       <w:r>
-        <w:t>SDF Task</w:t>
-        <w:br/>
-        <w:t xml:space="preserve">   ↓ Capability Router</w:t>
-        <w:br/>
-        <w:t>A2A Gateway</w:t>
-        <w:br/>
-        <w:t xml:space="preserve">   ├─ Security Agent</w:t>
-        <w:br/>
-        <w:t xml:space="preserve">   ├─ FinOps Agent</w:t>
-        <w:br/>
-        <w:t xml:space="preserve">   ├─ Incident Agent</w:t>
-        <w:br/>
-        <w:t xml:space="preserve">   └─ Another SDF</w:t>
-        <w:br/>
-        <w:br/>
-        <w:t>A2A boundary → identity + authN/authZ + OPA + data classification + audit</w:t>
+        <w:t>HISTORICAL OPTION — NOT ACTIVE</w:t>
+        <w:br/>
+        <w:t>SDF Task → future external-delegation decision → A2A Gateway</w:t>
+        <w:br/>
+        <w:br/>
+        <w:t>No A2A gateway is part of Core v0. A future gateway would still require identity, authorization, data classification, budget and audit.</w:t>
       </w:r>
     </w:p>
     <w:p>
@@ -5098,13 +5068,13 @@
         <w:pStyle w:val="Heading2"/>
       </w:pPr>
       <w:r>
-        <w:t>11.5 MCP: tool/resource boundary</w:t>
+        <w:t>11.5 Tool Proxy, Policy and optional MCP boundary</w:t>
       </w:r>
     </w:p>
     <w:p>
       <w:pPr/>
       <w:r>
-        <w:t>MCP nằm dưới agent/harness và chỉ nên chuẩn hóa tool/resource access. Tool Proxy/Policy vẫn phải quyết định principal/action/resource/context trước tool call; MCP không được trở thành đường bypass guardrail.</w:t>
+        <w:t>Tool Proxy evaluates policy before executing an action. An enforced sandbox constrains filesystem, process and network access even if an agent bypasses the proxy. MCP may be evaluated as a tool/resource integration, but it is not an authorization boundary and must not bypass Tool Proxy or Policy.</w:t>
       </w:r>
     </w:p>
     <w:p>
@@ -5118,7 +5088,7 @@
     <w:p>
       <w:pPr/>
       <w:r>
-        <w:t>Protocol interface không thay sandbox/runtime. SDF vẫn cần Worker/Sandbox Manager để provision workspace, process, CPU/RAM/disk/network limits, checkpoint/recovery và cleanup.</w:t>
+        <w:t>AgentRuntime does not replace sandbox/runtime. SDF still needs a Worker/Sandbox Manager for workspace provisioning, process lifecycle, CPU/RAM/disk/network limits, checkpoint/recovery and cleanup.</w:t>
       </w:r>
     </w:p>
     <w:p>
@@ -5150,7 +5120,7 @@
         <w:pStyle w:val="ListBullet"/>
       </w:pPr>
       <w:r>
-        <w:t>Herdr: optional persistent terminal/session fleet; không làm protocol contract.</w:t>
+        <w:t>HerdrRuntime: intended first execution/session provider; repository, version, license and lifecycle operations remain pending verification.</w:t>
       </w:r>
     </w:p>
     <w:p>
@@ -5166,7 +5136,7 @@
         <w:pStyle w:val="Heading2"/>
       </w:pPr>
       <w:r>
-        <w:t>11.7 Final execution path</w:t>
+        <w:t>11.7 Current execution path</w:t>
       </w:r>
     </w:p>
     <w:p>
@@ -5174,37 +5144,31 @@
         <w:pStyle w:val="CodeBlock"/>
       </w:pPr>
       <w:r>
-        <w:t>SDF Control</w:t>
-        <w:br/>
-        <w:t xml:space="preserve">    ↓</w:t>
-        <w:br/>
-        <w:t>Capability + Interface Router</w:t>
-        <w:br/>
-        <w:t xml:space="preserve">    ├──────── A2A → remote/specialist agent system</w:t>
-        <w:br/>
-        <w:t xml:space="preserve">    │</w:t>
-        <w:br/>
-        <w:t xml:space="preserve">    └─ coding task</w:t>
-        <w:br/>
-        <w:t xml:space="preserve">          ↓</w:t>
-        <w:br/>
-        <w:t xml:space="preserve">       ACP v1 ───fallback──→ Native Adapter</w:t>
-        <w:br/>
-        <w:t xml:space="preserve">          ↓                     ↓</w:t>
-        <w:br/>
-        <w:t xml:space="preserve">       Coding Agent / Harness</w:t>
-        <w:br/>
-        <w:t xml:space="preserve">          ↓</w:t>
-        <w:br/>
-        <w:t xml:space="preserve">      Sandbox / Worker</w:t>
-        <w:br/>
-        <w:t xml:space="preserve">          ↓</w:t>
-        <w:br/>
-        <w:t xml:space="preserve">       Tools via MCP / native tool proxy</w:t>
-        <w:br/>
-        <w:t xml:space="preserve">          ↓</w:t>
-        <w:br/>
-        <w:t xml:space="preserve">   Events → SDF Event Stream → Eval / Audit / Console</w:t>
+        <w:t>SDF Control Plane</w:t>
+        <w:br/>
+        <w:t xml:space="preserve">      ↓</w:t>
+        <w:br/>
+        <w:t>Internal Agent Runtime</w:t>
+        <w:br/>
+        <w:t xml:space="preserve">      ↓</w:t>
+        <w:br/>
+        <w:t>HerdrRuntime (intended; pending verification)</w:t>
+        <w:br/>
+        <w:t xml:space="preserve">      ↓</w:t>
+        <w:br/>
+        <w:t>One coding agent / harness</w:t>
+        <w:br/>
+        <w:t xml:space="preserve">      ↓</w:t>
+        <w:br/>
+        <w:t>Enforced Sandbox / Worker</w:t>
+        <w:br/>
+        <w:t xml:space="preserve">      ↓</w:t>
+        <w:br/>
+        <w:t>Tool Proxy + Policy → Tools</w:t>
+        <w:br/>
+        <w:t xml:space="preserve">      ↓</w:t>
+        <w:br/>
+        <w:t>Events → SDF Event Stream → Evaluator / Audit / Console</w:t>
       </w:r>
     </w:p>
     <w:p>
@@ -5917,29 +5881,19 @@
         <w:pStyle w:val="CodeBlock"/>
       </w:pPr>
       <w:r>
-        <w:t>ACP / Native / A2A events</w:t>
-        <w:br/>
-        <w:t xml:space="preserve">          ↓</w:t>
-        <w:br/>
-        <w:t xml:space="preserve">    SDF Event Stream</w:t>
-        <w:br/>
-        <w:t xml:space="preserve">          ↓</w:t>
-        <w:br/>
-        <w:t xml:space="preserve">     WebSocket / SSE</w:t>
-        <w:br/>
-        <w:t xml:space="preserve">          ↓</w:t>
-        <w:br/>
-        <w:t xml:space="preserve">       SDF Console</w:t>
-        <w:br/>
-        <w:t xml:space="preserve">          ├─ task / agent streams</w:t>
-        <w:br/>
-        <w:t xml:space="preserve">          ├─ approvals</w:t>
-        <w:br/>
-        <w:t xml:space="preserve">          ├─ incident room</w:t>
-        <w:br/>
-        <w:t xml:space="preserve">          ├─ release / policy / cost views</w:t>
-        <w:br/>
-        <w:t xml:space="preserve">          └─ Decision Graph navigation</w:t>
+        <w:t>Runtime events</w:t>
+        <w:br/>
+        <w:t xml:space="preserve">      ↓</w:t>
+        <w:br/>
+        <w:t>SDF Event Stream</w:t>
+        <w:br/>
+        <w:t xml:space="preserve">      ↓</w:t>
+        <w:br/>
+        <w:t>WebSocket / SSE</w:t>
+        <w:br/>
+        <w:t xml:space="preserve">      ↓</w:t>
+        <w:br/>
+        <w:t>SDF Console</w:t>
       </w:r>
     </w:p>
     <w:p>
@@ -7531,7 +7485,7 @@
           </w:tcPr>
           <w:p>
             <w:r>
-              <w:t>ACP v1 + native adapters</w:t>
+              <w:t>Internal Agent Runtime + HerdrRuntime (intended) + fake runtime for deterministic tests</w:t>
             </w:r>
           </w:p>
         </w:tc>
@@ -7548,7 +7502,7 @@
           </w:tcPr>
           <w:p>
             <w:r>
-              <w:t>ACP preferred when capability/SLO pass; native fallback mandatory for critical agents.</w:t>
+              <w:t>One provider first; validate lifecycle, containment and Evidence before adding another provider.</w:t>
             </w:r>
           </w:p>
         </w:tc>
@@ -7758,7 +7712,7 @@
               <w:rPr>
                 <w:sz w:val="16"/>
               </w:rPr>
-              <w:t>Herdr (optional)</w:t>
+              <w:t>HerdrRuntime (intended; verify repository, version, license and lifecycle API)</w:t>
             </w:r>
           </w:p>
         </w:tc>
@@ -7782,7 +7736,7 @@
               <w:rPr>
                 <w:sz w:val="16"/>
               </w:rPr>
-              <w:t>Phù hợp headless/remote sessions; audit license.</w:t>
+              <w:t>Persistent terminal/session fleet candidate for the first runtime integration; no Herdr API is claimed verified.</w:t>
             </w:r>
           </w:p>
         </w:tc>
@@ -9607,7 +9561,7 @@
           </w:tcPr>
           <w:p>
             <w:r>
-              <w:t>A2A 1.0 adapter/gateway</w:t>
+              <w:t>A2A historical research only; no active gateway roadmap</w:t>
             </w:r>
           </w:p>
         </w:tc>
@@ -9617,7 +9571,7 @@
           </w:tcPr>
           <w:p>
             <w:r>
-              <w:t>Use for specialist agents, remote agent systems and SDF--SDF delegation; keep SDF Task as source-of-truth logical work.</w:t>
+              <w:t>Reopen only through a concrete independent-agent-system requirement and a new ADR.</w:t>
             </w:r>
           </w:p>
         </w:tc>
@@ -9639,7 +9593,7 @@
           </w:tcPr>
           <w:p>
             <w:r>
-              <w:t>OpenTelemetry + SDF interface metrics</w:t>
+              <w:t>OpenTelemetry + SDF runtime metrics</w:t>
             </w:r>
           </w:p>
         </w:tc>
@@ -9649,7 +9603,7 @@
           </w:tcPr>
           <w:p>
             <w:r>
-              <w:t>Measure spawn/init/session/TTFT/final/cancel/failure per ACP/native/A2A interface.</w:t>
+              <w:t>Measure session start/output/cancel/termination/reconnect/failure per runtime provider.</w:t>
             </w:r>
           </w:p>
         </w:tc>
@@ -9702,7 +9656,7 @@
         <w:ind w:left="0" w:firstLine="0"/>
       </w:pPr>
       <w:r>
-        <w:t>3.  Agent Interface Router: chỉ một native adapter trong Core v0. ACP v1 là hạng mục interoperability sau Core v0, chỉ thêm khi có integration coding agent thứ hai hoặc nhu cầu editor/client portability được xác nhận.</w:t>
+        <w:t>3.  Internal Agent Runtime: một implementation đầu tiên cho một coding agent; HerdrRuntime là provider dự kiến sau khi sandbox và Herdr contract được xác minh. ACP/A2A không thuộc Core v0 execution path.</w:t>
       </w:r>
     </w:p>
     <w:p>
@@ -10167,7 +10121,7 @@
               <w:rPr>
                 <w:sz w:val="16"/>
               </w:rPr>
-              <w:t>Nhiều persistent terminal agents trên nhiều host</w:t>
+              <w:t>One intended execution/session provider</w:t>
             </w:r>
           </w:p>
         </w:tc>
@@ -10191,7 +10145,7 @@
               <w:rPr>
                 <w:sz w:val="16"/>
               </w:rPr>
-              <w:t>Herdr</w:t>
+              <w:t>HerdrRuntime integration after repository/license/API verification</w:t>
             </w:r>
           </w:p>
         </w:tc>
@@ -10255,7 +10209,7 @@
           </w:tcPr>
           <w:p>
             <w:r>
-              <w:t>Cross-agent / cross-organization delegation</w:t>
+              <w:t>Future independent-agent-system requirement</w:t>
             </w:r>
           </w:p>
         </w:tc>
@@ -10265,7 +10219,7 @@
           </w:tcPr>
           <w:p>
             <w:r>
-              <w:t>A2A 1.0 gateway + identity/policy boundary</w:t>
+              <w:t>Separate architecture decision; excluded from active roadmap</w:t>
             </w:r>
           </w:p>
         </w:tc>
@@ -10277,7 +10231,7 @@
           </w:tcPr>
           <w:p>
             <w:r>
-              <w:t>ACP adapter không đạt latency/reliability SLO</w:t>
+              <w:t>Additional runtime provider need</w:t>
             </w:r>
           </w:p>
         </w:tc>
@@ -10287,7 +10241,7 @@
           </w:tcPr>
           <w:p>
             <w:r>
-              <w:t>Native adapter path + evidence-based interface routing</w:t>
+              <w:t>Internal Agent Runtime provider routing based on measured evidence</w:t>
             </w:r>
           </w:p>
         </w:tc>
@@ -10301,19 +10255,19 @@
     <w:p>
       <w:pPr/>
       <w:r>
-        <w:t>Trước các activation gate trên, internal interface + native adapter + MCP cho tool/resource access là đủ; SDF Task, State, Budget, Policy và Evaluator vẫn là source of truth. Core v0 không triển khai ACP hoặc A2A trong execution path.</w:t>
+        <w:t>Core v0 uses Internal Agent Runtime + one provider implementation, with Tool Proxy/Policy and enforced sandbox as execution boundaries. HerdrRuntime is intended pending verification; ACP/A2A remain historical research and are excluded from the active roadmap.</w:t>
       </w:r>
     </w:p>
     <w:p>
       <w:pPr/>
       <w:r>
-        <w:t>A2A 1.0: Chỉ thêm A2A Gateway khi có remote specialist agent/SDF độc lập, khác trust domain/vendor/tổ chức, hoặc có nhu cầu discovery và task/artifact portability qua mạng.</w:t>
+        <w:t>Historical A2A activation criteria: a future independent-agent-system or external-SDF requirement would need a separate architecture decision; no A2A gateway is planned.</w:t>
       </w:r>
     </w:p>
     <w:p>
       <w:pPr/>
       <w:r>
-        <w:t>ACP v1: Chỉ nâng từ native adapter lên ACP khi có từ hai coding agent/harness hoặc cần portability giữa client/editor; ACP không phải dependency bắt buộc của SDF core.</w:t>
+        <w:t>Historical ACP activation criteria: a future external-client or coding-agent interoperability requirement would need a separate architecture decision; no ACP adapter is planned.</w:t>
       </w:r>
     </w:p>
     <w:p>
@@ -13430,7 +13384,7 @@
         <w:spacing w:after="40"/>
       </w:pPr>
       <w:r>
-        <w:t>Agent interface và runtime phải pluggable: ACP v1 là portable primary interface khi đạt SLO; native adapter là fallback; sandbox/runtime có thể thay mà không đổi core SDF.</w:t>
+        <w:t>Agent runtime và provider phải pluggable: Core sở hữu Internal Agent Runtime; HerdrRuntime là intended provider pending verification; sandbox/runtime có thể thay mà không đổi SDF domain core.</w:t>
       </w:r>
     </w:p>
     <w:p>
@@ -13580,7 +13534,7 @@
         <w:pStyle w:val="ListBullet"/>
       </w:pPr>
       <w:r>
-        <w:t>ACP/A2A/MCP là ba boundary khác nhau: coding-session, agent-system delegation và tool/resource integration; không dùng một protocol để thay toàn bộ orchestration stack.</w:t>
+        <w:t>Internal Agent Runtime, Tool Proxy/Policy và enforced sandbox là các execution boundaries; ACP/A2A research remains historical and is not an active Core v0 dependency.</w:t>
       </w:r>
     </w:p>
     <w:p>
@@ -13588,7 +13542,7 @@
         <w:pStyle w:val="ListBullet"/>
       </w:pPr>
       <w:r>
-        <w:t>Protocol reliability phải đo bằng SLO: spawn/init/session/TTFT/final/cancel/failure; Router được phép chọn native path khi adapter không đạt SLO.</w:t>
+        <w:t>Runtime provider reliability must be measured by SLO: start, output, final result, cancel, reconnect and failure; the internal runtime may select a provider only from measured evidence.</w:t>
       </w:r>
     </w:p>
     <w:p>
@@ -13622,135 +13576,7 @@
         <w:keepLines/>
       </w:pPr>
       <w:r>
-        <w:t xml:space="preserve">                          BUSINESS CONTEXT</w:t>
-        <w:br/>
-        <w:t xml:space="preserve">               Customer / Use case / Market / Contract</w:t>
-        <w:br/>
-        <w:t xml:space="preserve">                              ↓</w:t>
-        <w:br/>
-        <w:t xml:space="preserve">                    BUSINESS ECONOMICS</w:t>
-        <w:br/>
-        <w:t xml:space="preserve">             Cost / Value / Alternatives / Pricing</w:t>
-        <w:br/>
-        <w:t xml:space="preserve">                              ↓</w:t>
-        <w:br/>
-        <w:t xml:space="preserve">                    Economic Constraints</w:t>
-        <w:br/>
-        <w:t xml:space="preserve">                              ↓</w:t>
-        <w:br/>
-        <w:t xml:space="preserve">                  INTENT / DECISION GRAPH</w:t>
-        <w:br/>
-        <w:t xml:space="preserve"> Objective -- Assumption -- Constraint -- ADR -- Requirement -- Task</w:t>
-        <w:br/>
-        <w:t xml:space="preserve">      ↑                                                   ↓</w:t>
-        <w:br/>
-        <w:t xml:space="preserve"> Evidence / Metrics ← Evaluation ← Release ← Change / Code / IaC</w:t>
-        <w:br/>
-        <w:t xml:space="preserve">                              ↓</w:t>
-        <w:br/>
-        <w:t>Jira / Linear / GitHub Issues      Notion / SDF Console / Backstage</w:t>
-        <w:br/>
-        <w:t xml:space="preserve">             \                         /</w:t>
-        <w:br/>
-        <w:t xml:space="preserve">              └────── HUMAN PLANES ───┘</w:t>
-        <w:br/>
-        <w:t xml:space="preserve">                              ↓</w:t>
-        <w:br/>
-        <w:t xml:space="preserve">                    ┌──────────────────────┐</w:t>
-        <w:br/>
-        <w:t xml:space="preserve">                    │      SDF CONTROL     │</w:t>
-        <w:br/>
-        <w:t xml:space="preserve">                    │ Task / Planner       │</w:t>
-        <w:br/>
-        <w:t xml:space="preserve">                    │ State / Router       │</w:t>
-        <w:br/>
-        <w:t xml:space="preserve">                    │ Scheduler            │</w:t>
-        <w:br/>
-        <w:t xml:space="preserve">                    │ Release / Env Mgr    │</w:t>
-        <w:br/>
-        <w:t xml:space="preserve">                    └──────────┬───────────┘</w:t>
-        <w:br/>
-        <w:t xml:space="preserve">                               │</w:t>
-        <w:br/>
-        <w:t xml:space="preserve">        ┌──────────────────────┼──────────────────────┐</w:t>
-        <w:br/>
-        <w:t xml:space="preserve">        ↓                      ↓                      ↓</w:t>
-        <w:br/>
-        <w:t xml:space="preserve"> Memory / Context         Policy Plane         Quality / Learning</w:t>
-        <w:br/>
-        <w:t xml:space="preserve"> OpenViking              OPA/Cedar/...         Eval / Experience</w:t>
-        <w:br/>
-        <w:t xml:space="preserve"> Context Builder         Policy Registry       Evolver</w:t>
-        <w:br/>
-        <w:t xml:space="preserve">        └──────────────────────┼──────────────────────┘</w:t>
-        <w:br/>
-        <w:t xml:space="preserve">                               ↓</w:t>
-        <w:br/>
-        <w:t xml:space="preserve">                    PROTOCOL / INTEROP LAYER</w:t>
-        <w:br/>
-        <w:t xml:space="preserve">          ┌────────────────────┼────────────────────┐</w:t>
-        <w:br/>
-        <w:t xml:space="preserve">          ↓                    ↓                    ↓</w:t>
-        <w:br/>
-        <w:t xml:space="preserve">         A2A                  ACP                  MCP</w:t>
-        <w:br/>
-        <w:t xml:space="preserve"> Agent/SDF delegation   Coding agent session   Tools/resources</w:t>
-        <w:br/>
-        <w:t xml:space="preserve">          │                    │                    │</w:t>
-        <w:br/>
-        <w:t xml:space="preserve">          │             Native fallback            │</w:t>
-        <w:br/>
-        <w:t xml:space="preserve">          │                    ↓                    │</w:t>
-        <w:br/>
-        <w:t xml:space="preserve">          └──────────→ Coding Agents / Harnesses ←─┘</w:t>
-        <w:br/>
-        <w:t xml:space="preserve">                               ↓</w:t>
-        <w:br/>
-        <w:t xml:space="preserve">                     Sandbox / Worker Manager</w:t>
-        <w:br/>
-        <w:t xml:space="preserve">                               ↓</w:t>
-        <w:br/>
-        <w:t xml:space="preserve">                       Source / PR / Code</w:t>
-        <w:br/>
-        <w:t xml:space="preserve">                               ↓</w:t>
-        <w:br/>
-        <w:t xml:space="preserve">             CI → signed immutable artifact → Release</w:t>
-        <w:br/>
-        <w:t xml:space="preserve">                               ↓</w:t>
-        <w:br/>
-        <w:t xml:space="preserve">                    GitOps / Environments</w:t>
-        <w:br/>
-        <w:t xml:space="preserve">                               ↓</w:t>
-        <w:br/>
-        <w:t xml:space="preserve">                  Observability / Alert Router</w:t>
-        <w:br/>
-        <w:t xml:space="preserve">                               ↓</w:t>
-        <w:br/>
-        <w:t xml:space="preserve">                    Incident / Runtime Metrics</w:t>
-        <w:br/>
-        <w:t xml:space="preserve">                               ↓</w:t>
-        <w:br/>
-        <w:t xml:space="preserve">                 FINOPS / ACTUAL ECONOMICS</w:t>
-        <w:br/>
-        <w:t xml:space="preserve">        Cost attribution / forecast / unit economics / optimization</w:t>
-        <w:br/>
-        <w:t xml:space="preserve">                               ↓</w:t>
-        <w:br/>
-        <w:t xml:space="preserve">         Runtime evidence updates Decision Graph → ADAPT</w:t>
-        <w:br/>
-        <w:br/>
-        <w:t>HUMAN INTERFACE</w:t>
-        <w:br/>
-        <w:t>ACP/A2A/native events → SDF Event Stream → WebSocket/SSE → SDF Console</w:t>
-        <w:br/>
-        <w:t>External chat/ticket/email adapters are optional projections.</w:t>
-        <w:br/>
-        <w:br/>
-        <w:t>PORTABLE OUTPUT</w:t>
-        <w:br/>
-        <w:t>source + tests + SBOM/provenance + Project Passport + Policy Pack</w:t>
-        <w:br/>
-        <w:t>+ Intent/Decision Graph snapshot + business context + economics/ + finops/ + release/catalog metadata</w:t>
+        <w:t>Runtime events → SDF Event Stream → WebSocket/SSE → SDF Console</w:t>
       </w:r>
     </w:p>
     <w:tbl>
@@ -13783,11 +13609,9 @@
               <w:rPr>
                 <w:b/>
               </w:rPr>
-              <w:t xml:space="preserve">Khuyến nghị thực dụng: </w:t>
-            </w:r>
-            <w:r>
-              <w:t>Core commercial backend nên ưu tiên API-first, sandbox-first và permissive-license components. Orca nên là optional coding cockpit; Herdr là optional terminal fleet runtime; memory provider cần abstraction để thay thế khi license/maturity không phù hợp. Giá trị riêng của sản phẩm nằm ở SDF control logic, evaluation policy, experience model, incident workflows, routing/evolution và portability.</w:t>
-            </w:r>
+              <w:t>Khuyến nghị thực dụng: Core commercial backend nên ưu tiên API-first, sandbox-first và permissive-license components. Orca nên là optional coding cockpit; HerdrRuntime là execution/session provider dự kiến, pending repository, license, API and lifecycle verification; memory provider cần abstraction để thay thế khi license/maturity không phù hợp. Giá trị riêng của sản phẩm nằm ở SDF control logic, evaluation policy, experience model, incident workflows, routing/evolution và portability.</w:t>
+            </w:r>
+            <w:r/>
           </w:p>
         </w:tc>
       </w:tr>
@@ -13963,7 +13787,7 @@
         <w:pStyle w:val="ListBullet"/>
       </w:pPr>
       <w:r>
-        <w:t>Benchmark cùng workload qua native vs ACP cho từng critical agent; đặt SLO cho initialize/session/TTFT/final/cancel và tự động fallback khi protocol path xuống cấp.</w:t>
+        <w:t>Verify the HerdrRuntime contract on one agent: start/input/output/status/cancel/terminate/reconnect, session correlation, timeout cleanup and duplicate-dispatch behavior.</w:t>
       </w:r>
     </w:p>
     <w:p>
@@ -13971,7 +13795,7 @@
         <w:pStyle w:val="ListBullet"/>
       </w:pPr>
       <w:r>
-        <w:t>Pin ACP stable v1 và A2A released 1.x contract; unstable/preview protocol features phải capability-gated và không được thành dependency bắt buộc.</w:t>
+        <w:t>Keep ACP/A2A research versioned as historical context; reopen either only through a concrete requirement and a new ADR.</w:t>
       </w:r>
     </w:p>
     <w:p>
@@ -13979,7 +13803,7 @@
         <w:pStyle w:val="ListBullet"/>
       </w:pPr>
       <w:r>
-        <w:t>Threat-model A2A như network/organization boundary: identity, mTLS/OAuth as applicable, OPA authorization, data classification, budget và audit trước delegation.</w:t>
+        <w:t>Prove Tool Proxy/Policy and enforced sandbox boundaries before granting a real agent access beyond disposable fixtures.</w:t>
       </w:r>
     </w:p>
     <w:p>
@@ -15608,7 +15432,7 @@
               <w:rPr>
                 <w:sz w:val="15"/>
               </w:rPr>
-              <w:t>Agent Client Protocol: contract client/SDF -- coding agent cho initialize, session, prompt, streaming updates, permission/cancel; v1 là baseline stable trong tài liệu này.</w:t>
+              <w:t>Agent Client Protocol (historical): earlier client/SDF -- coding agent contract research; excluded from active roadmap.</w:t>
             </w:r>
           </w:p>
         </w:tc>
@@ -15650,7 +15474,7 @@
               <w:rPr>
                 <w:sz w:val="15"/>
               </w:rPr>
-              <w:t>Agent2Agent Protocol: contract giữa independent agent systems/SDFs cho discovery, delegation, task/message/artifact exchange.</w:t>
+              <w:t>Agent2Agent Protocol (historical): earlier independent-agent-system delegation research; excluded from active roadmap.</w:t>
             </w:r>
           </w:p>
         </w:tc>
@@ -15734,7 +15558,7 @@
               <w:rPr>
                 <w:sz w:val="15"/>
               </w:rPr>
-              <w:t>Agent-specific integration path dùng làm fallback khi protocol adapter thiếu capability hoặc không đạt latency/reliability SLO.</w:t>
+              <w:t>Historical native-adapter term; current seam is Internal Agent Runtime with a provider implementation.</w:t>
             </w:r>
           </w:p>
         </w:tc>

</xml_diff>